<commit_message>
Actualización CR y SCI
</commit_message>
<xml_diff>
--- a/Software Configuration Item1 (SIGIAL)_v.0.docx
+++ b/Software Configuration Item1 (SIGIAL)_v.0.docx
@@ -6382,28 +6382,6 @@
     </w:p>
     <w:p>
       <w:pPr>
-        <w:spacing w:after="0" w:line="240" w:lineRule="auto"/>
-        <w:jc w:val="both"/>
-        <w:rPr>
-          <w:rFonts w:ascii="Arial" w:eastAsia="Times New Roman" w:hAnsi="Arial" w:cs="Arial"/>
-          <w:sz w:val="24"/>
-          <w:szCs w:val="24"/>
-        </w:rPr>
-      </w:pPr>
-    </w:p>
-    <w:p>
-      <w:pPr>
-        <w:spacing w:after="0" w:line="240" w:lineRule="auto"/>
-        <w:jc w:val="both"/>
-        <w:rPr>
-          <w:rFonts w:ascii="Arial" w:eastAsia="Times New Roman" w:hAnsi="Arial" w:cs="Arial"/>
-          <w:sz w:val="24"/>
-          <w:szCs w:val="24"/>
-        </w:rPr>
-      </w:pPr>
-    </w:p>
-    <w:p>
-      <w:pPr>
         <w:spacing w:before="100" w:beforeAutospacing="1" w:after="100" w:afterAutospacing="1" w:line="240" w:lineRule="auto"/>
         <w:jc w:val="both"/>
         <w:outlineLvl w:val="0"/>
@@ -6425,6 +6403,7 @@
           <w:sz w:val="28"/>
           <w:szCs w:val="28"/>
         </w:rPr>
+        <w:lastRenderedPageBreak/>
         <w:t>11. Conclusion</w:t>
       </w:r>
       <w:r>
@@ -8536,6 +8515,7 @@
   <w:style w:type="character" w:default="1" w:styleId="Fuentedeprrafopredeter">
     <w:name w:val="Default Paragraph Font"/>
     <w:uiPriority w:val="1"/>
+    <w:semiHidden/>
     <w:unhideWhenUsed/>
   </w:style>
   <w:style w:type="table" w:default="1" w:styleId="Tablanormal">

</xml_diff>